<commit_message>
Consolidate SQL scripts into script_completo.sql
Merge and cleanup: removed fragmented SQL files (01..06 and related procedural files) and replace them with a single, self-contained script_completo.sql that contains schema, programability objects, CRUD procedures, views, sample data and demo queries. Added GUIA_DEFENSA_SQL.md (extensive defense guide) and updated documentation: README.md (execution instructions), DICCIONARIO_DATOS.md (normalize VARCHAR types and minor notes) and DECISIONES_EQUIPO.md (references to script_completo). Also updated Informe_TP_Grupo3.docx. Purpose: simplify execution and provide a comprehensive guide for defense and evaluation.
</commit_message>
<xml_diff>
--- a/Informe_TP_Grupo3.docx
+++ b/Informe_TP_Grupo3.docx
@@ -445,7 +445,7 @@
         <w:jc w:val="both"/>
       </w:pPr>
       <w:r>
-        <w:t>Este proyecto tiene como objetivo diseñar e implementar una base de datos relacional en Microsoft SQL Server para la gestión del material de un depósito militar de aeropartes y herramientas aeronáuticas (basado en el Taller G.T.1 de la I Brigada Aérea). El sistema reemplaza la gestión manual, basada en registros informales y dispersos, por un modelo normalizado a Tercera Forma Normal (3FN) compuesto por 12 tablas, con lógica de negocio implementada en el servidor: funciones escalares, triggers, procedimientos almacenados (CRUD y de negocio), un cursor y vistas. El sistema controla el ciclo de vida completo de cada elemento (alta, cambios de estado mediante tarjetas, retiros y retornos del depósito y baja definitiva) y asegura la integridad de los datos y la trazabilidad mediante restricciones declarativas y programación Transact-SQL. La base fue verificada de extremo a extremo sobre el motor de SQL Server.</w:t>
+        <w:t>Este proyecto tiene como objetivo diseñar e implementar una base de datos relacional en Microsoft SQL Server para la gestión del material de un depósito militar de aeropartes y herramientas aeronáuticas (basado en el Taller G.T.1 de la I Brigada Aérea). El sistema reemplaza la gestión manual, basada en registros informales y dispersos, por un modelo normalizado a Tercera Forma Normal (3FN) compuesto por 12 tablas, con lógica de negocio implementada en el servidor: una función escalar, dos triggers, procedimientos almacenados (CRUD y de negocio) y vistas. El sistema controla el ciclo de vida completo de cada elemento (alta, cambios de estado mediante tarjetas, retiros y retornos del depósito y baja definitiva) y asegura la integridad de los datos y la trazabilidad mediante restricciones declarativas y programación Transact-SQL. La base fue verificada de extremo a extremo sobre el motor de SQL Server.</w:t>
       </w:r>
     </w:p>
     <w:p>
@@ -1917,7 +1917,7 @@
         <w:jc w:val="both"/>
       </w:pPr>
       <w:r>
-        <w:t>El esquema físico está implementado en el script gestion_material.sql (DDL): 12 tablas con sus tipos de datos, restricciones (PRIMARY KEY, FOREIGN KEY, UNIQUE, CHECK) y datos semilla. La convención de nomenclatura sigue el estándar de la cátedra: tablas en PascalCase y plural, columnas con sufijo de entidad, claves primarias IDENTITY(1,1) en línea, restricciones nombradas (PK_/FK_/UQ_/CHK_), y tipos VARCHAR/CHAR para códigos y NVARCHAR para texto. A modo de ejemplo, la tabla de salidas:</w:t>
+        <w:t>El esquema físico está implementado en la Parte 01 del script script_completo.sql (DDL): 12 tablas con sus tipos de datos, restricciones (PRIMARY KEY, FOREIGN KEY, UNIQUE, CHECK) y datos semilla. La convención de nomenclatura sigue el estándar de la cátedra: tablas en PascalCase y plural, columnas con sufijo de entidad, claves primarias IDENTITY(1,1) en línea, restricciones nombradas (PK_/FK_/UQ_/CHK_), y tipos VARCHAR y CHAR para códigos y texto. A modo de ejemplo, la tabla de salidas:</w:t>
       </w:r>
     </w:p>
     <w:p>
@@ -2246,7 +2246,7 @@
               <w:rPr>
                 <w:sz w:val="16"/>
               </w:rPr>
-              <w:t>NVARCHAR</w:t>
+              <w:t>VARCHAR</w:t>
             </w:r>
           </w:p>
         </w:tc>
@@ -2346,7 +2346,7 @@
               <w:rPr>
                 <w:sz w:val="16"/>
               </w:rPr>
-              <w:t>NVARCHAR</w:t>
+              <w:t>VARCHAR</w:t>
             </w:r>
           </w:p>
         </w:tc>
@@ -2446,7 +2446,7 @@
               <w:rPr>
                 <w:sz w:val="16"/>
               </w:rPr>
-              <w:t>NVARCHAR</w:t>
+              <w:t>VARCHAR</w:t>
             </w:r>
           </w:p>
         </w:tc>
@@ -2786,7 +2786,7 @@
               <w:rPr>
                 <w:sz w:val="16"/>
               </w:rPr>
-              <w:t>NVARCHAR</w:t>
+              <w:t>VARCHAR</w:t>
             </w:r>
           </w:p>
         </w:tc>
@@ -3226,7 +3226,7 @@
               <w:rPr>
                 <w:sz w:val="16"/>
               </w:rPr>
-              <w:t>NVARCHAR</w:t>
+              <w:t>VARCHAR</w:t>
             </w:r>
           </w:p>
         </w:tc>
@@ -3666,7 +3666,7 @@
               <w:rPr>
                 <w:sz w:val="16"/>
               </w:rPr>
-              <w:t>NVARCHAR</w:t>
+              <w:t>VARCHAR</w:t>
             </w:r>
           </w:p>
         </w:tc>
@@ -4006,7 +4006,7 @@
               <w:rPr>
                 <w:sz w:val="16"/>
               </w:rPr>
-              <w:t>NVARCHAR</w:t>
+              <w:t>VARCHAR</w:t>
             </w:r>
           </w:p>
         </w:tc>
@@ -4106,7 +4106,7 @@
               <w:rPr>
                 <w:sz w:val="16"/>
               </w:rPr>
-              <w:t>NVARCHAR</w:t>
+              <w:t>VARCHAR</w:t>
             </w:r>
           </w:p>
         </w:tc>
@@ -4206,7 +4206,7 @@
               <w:rPr>
                 <w:sz w:val="16"/>
               </w:rPr>
-              <w:t>NVARCHAR</w:t>
+              <w:t>VARCHAR</w:t>
             </w:r>
           </w:p>
         </w:tc>
@@ -4646,7 +4646,7 @@
               <w:rPr>
                 <w:sz w:val="16"/>
               </w:rPr>
-              <w:t>NVARCHAR</w:t>
+              <w:t>VARCHAR</w:t>
             </w:r>
           </w:p>
         </w:tc>
@@ -4886,7 +4886,7 @@
               <w:rPr>
                 <w:sz w:val="16"/>
               </w:rPr>
-              <w:t>NVARCHAR</w:t>
+              <w:t>VARCHAR</w:t>
             </w:r>
           </w:p>
         </w:tc>
@@ -5086,7 +5086,7 @@
               <w:rPr>
                 <w:sz w:val="16"/>
               </w:rPr>
-              <w:t>NVARCHAR</w:t>
+              <w:t>VARCHAR</w:t>
             </w:r>
           </w:p>
         </w:tc>
@@ -5242,7 +5242,7 @@
               <w:rPr>
                 <w:sz w:val="16"/>
               </w:rPr>
-              <w:t>-</w:t>
+              <w:t>CHECK 0-99</w:t>
             </w:r>
           </w:p>
         </w:tc>
@@ -5726,7 +5726,7 @@
               <w:rPr>
                 <w:sz w:val="16"/>
               </w:rPr>
-              <w:t>NVARCHAR</w:t>
+              <w:t>VARCHAR</w:t>
             </w:r>
           </w:p>
         </w:tc>
@@ -6066,7 +6066,7 @@
               <w:rPr>
                 <w:sz w:val="16"/>
               </w:rPr>
-              <w:t>NVARCHAR</w:t>
+              <w:t>VARCHAR</w:t>
             </w:r>
           </w:p>
         </w:tc>
@@ -6366,7 +6366,7 @@
               <w:rPr>
                 <w:sz w:val="16"/>
               </w:rPr>
-              <w:t>NVARCHAR</w:t>
+              <w:t>VARCHAR</w:t>
             </w:r>
           </w:p>
         </w:tc>
@@ -6466,7 +6466,7 @@
               <w:rPr>
                 <w:sz w:val="16"/>
               </w:rPr>
-              <w:t>NVARCHAR</w:t>
+              <w:t>VARCHAR</w:t>
             </w:r>
           </w:p>
         </w:tc>
@@ -7506,7 +7506,7 @@
               <w:rPr>
                 <w:sz w:val="16"/>
               </w:rPr>
-              <w:t>NVARCHAR</w:t>
+              <w:t>VARCHAR</w:t>
             </w:r>
           </w:p>
         </w:tc>
@@ -7606,7 +7606,7 @@
               <w:rPr>
                 <w:sz w:val="16"/>
               </w:rPr>
-              <w:t>NVARCHAR</w:t>
+              <w:t>VARCHAR</w:t>
             </w:r>
           </w:p>
         </w:tc>
@@ -8346,7 +8346,7 @@
               <w:rPr>
                 <w:sz w:val="16"/>
               </w:rPr>
-              <w:t>NVARCHAR</w:t>
+              <w:t>VARCHAR</w:t>
             </w:r>
           </w:p>
         </w:tc>
@@ -8546,7 +8546,7 @@
               <w:rPr>
                 <w:sz w:val="16"/>
               </w:rPr>
-              <w:t>NVARCHAR</w:t>
+              <w:t>VARCHAR</w:t>
             </w:r>
           </w:p>
         </w:tc>
@@ -9086,7 +9086,7 @@
               <w:rPr>
                 <w:sz w:val="16"/>
               </w:rPr>
-              <w:t>NVARCHAR</w:t>
+              <w:t>VARCHAR</w:t>
             </w:r>
           </w:p>
         </w:tc>
@@ -9486,7 +9486,7 @@
               <w:rPr>
                 <w:sz w:val="16"/>
               </w:rPr>
-              <w:t>NVARCHAR</w:t>
+              <w:t>VARCHAR</w:t>
             </w:r>
           </w:p>
         </w:tc>
@@ -9586,7 +9586,7 @@
               <w:rPr>
                 <w:sz w:val="16"/>
               </w:rPr>
-              <w:t>NVARCHAR</w:t>
+              <w:t>VARCHAR</w:t>
             </w:r>
           </w:p>
         </w:tc>
@@ -10282,7 +10282,7 @@
         <w:jc w:val="both"/>
       </w:pPr>
       <w:r>
-        <w:t>El proyecto se organiza en seis scripts que se ejecutan en orden: 01) gestion_material.sql (esquema), 02) 02_programabilidad.sql (funciones, triggers, procedimientos y cursor), 03) 03_crud.sql (CRUD por tabla), 04) 04_vistas.sql (vistas), 05) 05_datos_ejemplo.sql (datos) y 06) 06_consultas_demostracion.sql (consultas de demostración).</w:t>
+        <w:t>El proyecto se entrega en un único script, script_completo.sql, que se ejecuta de arriba hacia abajo (los lotes se separan con GO). Está organizado en seis partes en orden de dependencia: 01) esquema (DDL), 02) programabilidad (una función, dos triggers y un procedimiento), 03) procedimientos CRUD (Insert y Read) por tabla, 04) vistas, 05) datos de ejemplo y 06) consultas de demostración y pruebas de validación.</w:t>
       </w:r>
     </w:p>
     <w:p>
@@ -10298,7 +10298,7 @@
         <w:jc w:val="both"/>
       </w:pPr>
       <w:r>
-        <w:t>El script 05_datos_ejemplo.sql carga datos de prueba realistas cumpliendo el mínimo de al menos 10 filas por tabla (los catálogos fijos EstadosElemento y MotivosSalida tienen 3 y 4 filas por ser tablas de tipo/categoría, sembradas en el script 01). Las altas se realizan mediante el procedimiento sp_AltaElemento y las operaciones (salidas, retornos, cambios de estado y bajas) mediante los procedimientos de negocio, de modo que los triggers se disparen y los datos queden coherentes. Recuento de filas cargadas:</w:t>
+        <w:t>La Parte 05 del script carga datos de prueba realistas cumpliendo el mínimo de al menos 10 filas por tabla (los catálogos fijos EstadosElemento y MotivosSalida tienen 3 y 4 filas por ser tablas de tipo/categoría, sembradas en el script 01). Los datos se cargan con sentencias INSERT directas; el procedimiento sp_AltaElemento se muestra además con un ejemplo de uso al final de la parte, y el trigger de salidas mantiene coherente la ubicación de los elementos que quedan afuera. Recuento de filas cargadas:</w:t>
       </w:r>
     </w:p>
     <w:tbl>
@@ -10616,7 +10616,7 @@
               <w:rPr>
                 <w:sz w:val="18"/>
               </w:rPr>
-              <w:t>15</w:t>
+              <w:t>16</w:t>
             </w:r>
           </w:p>
         </w:tc>
@@ -10646,7 +10646,7 @@
               <w:rPr>
                 <w:sz w:val="18"/>
               </w:rPr>
-              <w:t>19</w:t>
+              <w:t>20</w:t>
             </w:r>
           </w:p>
         </w:tc>
@@ -10676,7 +10676,7 @@
               <w:rPr>
                 <w:sz w:val="18"/>
               </w:rPr>
-              <w:t>14</w:t>
+              <w:t>10</w:t>
             </w:r>
           </w:p>
         </w:tc>
@@ -10726,7 +10726,7 @@
         <w:jc w:val="both"/>
       </w:pPr>
       <w:r>
-        <w:t>El script 06 incluye consultas básicas y avanzadas, una por cada tema de SQL evaluado:</w:t>
+        <w:t>La Parte 06 del script incluye consultas de demostración (una por cada tema de SQL evaluado) y un bloque de pruebas de validación:</w:t>
       </w:r>
     </w:p>
     <w:tbl>
@@ -11186,7 +11186,7 @@
               <w:rPr>
                 <w:sz w:val="18"/>
               </w:rPr>
-              <w:t>Consulta sobre las cuatro vistas</w:t>
+              <w:t>Consulta sobre las dos vistas</w:t>
             </w:r>
           </w:p>
         </w:tc>
@@ -11216,7 +11216,7 @@
               <w:rPr>
                 <w:sz w:val="18"/>
               </w:rPr>
-              <w:t>Cursor (procedimiento)</w:t>
+              <w:t>JOIN</w:t>
             </w:r>
           </w:p>
         </w:tc>
@@ -11230,7 +11230,7 @@
               <w:rPr>
                 <w:sz w:val="18"/>
               </w:rPr>
-              <w:t>Reporte de salidas vencidas</w:t>
+              <w:t>Cada ejemplar con su material y su ubicación</w:t>
             </w:r>
           </w:p>
         </w:tc>
@@ -11260,7 +11260,7 @@
               <w:rPr>
                 <w:sz w:val="18"/>
               </w:rPr>
-              <w:t>Pruebas de reglas</w:t>
+              <w:t>GROUP BY por tipo</w:t>
             </w:r>
           </w:p>
         </w:tc>
@@ -11274,7 +11274,7 @@
               <w:rPr>
                 <w:sz w:val="18"/>
               </w:rPr>
-              <w:t>Operaciones inválidas que deben fallar</w:t>
+              <w:t>Cantidad de materiales del catálogo por tipo</w:t>
             </w:r>
           </w:p>
         </w:tc>
@@ -11294,7 +11294,7 @@
         <w:jc w:val="both"/>
       </w:pPr>
       <w:r>
-        <w:t>Se implementaron cuatro triggers (tres AFTER y uno INSTEAD OF):</w:t>
+        <w:t>Se implementaron dos triggers (uno AFTER y uno INSTEAD OF):</w:t>
       </w:r>
     </w:p>
     <w:p>
@@ -11318,7 +11318,15 @@
         </w:numPr>
       </w:pPr>
       <w:r>
-        <w:t>trg_salida_baja_genera_tarjeta (AFTER INSERT en Salidas): si el motivo es BAJA, genera automáticamente la tarjeta en estado BAJA y desactiva la anterior.</w:t>
+        <w:t>trg_estado_no_borrar (INSTEAD OF DELETE en EstadosElemento): impide borrar un estado en uso por tarjetas, con THROW 50002.</w:t>
+      </w:r>
+    </w:p>
+    <w:p>
+      <w:pPr>
+        <w:jc w:val="both"/>
+      </w:pPr>
+      <w:r>
+        <w:t>Y dos vistas:</w:t>
       </w:r>
     </w:p>
     <w:p>
@@ -11330,7 +11338,7 @@
         </w:numPr>
       </w:pPr>
       <w:r>
-        <w:t>trg_tarjeta_no_reactiva_baja (AFTER INSERT en Tarjetas): impide reactivar un elemento dado de baja (integridad de transiciones), con THROW 50001.</w:t>
+        <w:t>vw_stock_disponible: elementos en servicio y dentro del depósito.</w:t>
       </w:r>
     </w:p>
     <w:p>
@@ -11342,15 +11350,39 @@
         </w:numPr>
       </w:pPr>
       <w:r>
-        <w:t>trg_estado_no_borrar (INSTEAD OF DELETE en EstadosElemento): impide borrar un estado en uso por tarjetas, con THROW 50002.</w:t>
+        <w:t>vw_historial_tarjetas: todas las tarjetas de cada elemento (la activa marcada).</w:t>
       </w:r>
     </w:p>
     <w:p>
       <w:pPr>
+        <w:pStyle w:val="Ttulo2"/>
+      </w:pPr>
+      <w:r>
+        <w:t>Funciones y Procedimientos</w:t>
+      </w:r>
+    </w:p>
+    <w:p>
+      <w:pPr>
         <w:jc w:val="both"/>
       </w:pPr>
       <w:r>
-        <w:t>Y cuatro vistas:</w:t>
+        <w:t>Se implementó una función escalar, fn_EstadoActual, que devuelve el código del estado de la tarjeta activa de un elemento (se usa en una vista y en una consulta). En cuanto a procedimientos almacenados, hay uno de negocio, sp_AltaElemento, que da de alta un ejemplar y su tarjeta dentro de una transacción, y dos procedimientos CRUD (Insert y Read) para cada una de las 12 tablas, totalizando 25 procedimientos. sp_AltaElemento usa parámetros de entrada y salida, transacción (BEGIN TRAN/COMMIT/ROLLBACK) y manejo de errores con TRY/CATCH y THROW.</w:t>
+      </w:r>
+    </w:p>
+    <w:p>
+      <w:pPr>
+        <w:pStyle w:val="Ttulo2"/>
+      </w:pPr>
+      <w:r>
+        <w:t>Pruebas y Validación</w:t>
+      </w:r>
+    </w:p>
+    <w:p>
+      <w:pPr>
+        <w:jc w:val="both"/>
+      </w:pPr>
+      <w:r>
+        <w:t xml:space="preserve">Al final de la Parte 06 se incluyen pruebas de validación: operaciones inválidas escritas como comentarios (no se ejecutan) que documentan qué rechaza el motor. Para verificarlas se descomenta y ejecuta una por una; cada una falla con el error indicado. Casos:</w:t>
       </w:r>
     </w:p>
     <w:p>
@@ -11360,9 +11392,10 @@
           <w:ilvl w:val="0"/>
           <w:numId w:val="1"/>
         </w:numPr>
+        <w:jc w:val="both"/>
       </w:pPr>
       <w:r>
-        <w:t>vw_elementos_afuera: elementos con salida abierta, su motivo, destino y días afuera.</w:t>
+        <w:t xml:space="preserve">P1 — Tipo de dato: se intenta insertar el texto ‘DIEZ’ en una columna numérica (INT). Rechazado: error de conversión (Msg 245).</w:t>
       </w:r>
     </w:p>
     <w:p>
@@ -11372,9 +11405,10 @@
           <w:ilvl w:val="0"/>
           <w:numId w:val="1"/>
         </w:numPr>
+        <w:jc w:val="both"/>
       </w:pPr>
       <w:r>
-        <w:t>vw_stock_disponible: elementos en servicio y dentro del depósito.</w:t>
+        <w:t xml:space="preserve">P2 — Rango numérico: se intenta cargar un capítulo ATA = 150, fuera del rango permitido 0–99. Rechazado por la restricción CHECK CHK_CatalogoMateriales_ATA (Msg 547).</w:t>
       </w:r>
     </w:p>
     <w:p>
@@ -11384,9 +11418,10 @@
           <w:ilvl w:val="0"/>
           <w:numId w:val="1"/>
         </w:numPr>
+        <w:jc w:val="both"/>
       </w:pPr>
       <w:r>
-        <w:t>vw_historial_tarjetas: todas las tarjetas de cada elemento (la activa marcada).</w:t>
+        <w:t xml:space="preserve">P3 — Dominio: se intenta cargar un capítulo ATA = ‘ABC’ (texto no numérico). Rechazado por la misma restricción CHECK (Msg 547).</w:t>
       </w:r>
     </w:p>
     <w:p>
@@ -11396,17 +11431,23 @@
           <w:ilvl w:val="0"/>
           <w:numId w:val="1"/>
         </w:numPr>
+        <w:jc w:val="both"/>
       </w:pPr>
       <w:r>
-        <w:t>vw_elementos_vencidos: elementos cuya fecha de vencimiento ya pasó.</w:t>
+        <w:t xml:space="preserve">P4 — Coherencia de fechas: se intenta una salida con fecha de retorno anterior a la fecha de salida. Rechazado por la restricción CHECK CHK_Salidas_RetornoPosterior (Msg 547).</w:t>
       </w:r>
     </w:p>
     <w:p>
       <w:pPr>
-        <w:pStyle w:val="Ttulo2"/>
+        <w:pStyle w:val="Prrafodelista"/>
+        <w:numPr>
+          <w:ilvl w:val="0"/>
+          <w:numId w:val="1"/>
+        </w:numPr>
+        <w:jc w:val="both"/>
       </w:pPr>
       <w:r>
-        <w:t>Funciones y Procedimientos</w:t>
+        <w:t xml:space="preserve">P5 — Integridad: se intenta borrar un estado que está en uso por tarjetas. Lo impide el trigger trg_estado_no_borrar (Msg 50002).</w:t>
       </w:r>
     </w:p>
     <w:p>
@@ -11414,7 +11455,7 @@
         <w:jc w:val="both"/>
       </w:pPr>
       <w:r>
-        <w:t>Se implementaron tres funciones escalares: fn_DiasFueraDeposito, fn_EstadoActual y fn_DiasParaVencer (usadas en las vistas y consultas). En cuanto a procedimientos almacenados, hay cinco de negocio (sp_AltaElemento, sp_RegistrarSalida, sp_RegistrarRetorno, sp_CambiarEstado y sp_ReporteSalidasVencidas, este último con cursor) y un set CRUD completo (Insert/Read/Update/Delete) para cada una de las 12 tablas, totalizando 52 procedimientos. Los procedimientos usan parámetros de entrada y salida, transacciones (BEGIN TRAN/COMMIT/ROLLBACK), validaciones con EXISTS y manejo de errores con TRY/CATCH y THROW.</w:t>
+        <w:t xml:space="preserve">Las cinco operaciones son rechazadas por el motor, lo que confirma que la integridad se garantiza en la base de datos y no en la aplicación cliente.</w:t>
       </w:r>
     </w:p>
     <w:p>
@@ -11902,7 +11943,7 @@
         </w:numPr>
       </w:pPr>
       <w:r>
-        <w:t>Scripts SQL: gestion_material.sql, 02_programabilidad.sql, 03_crud.sql, 04_vistas.sql, 05_datos_ejemplo.sql, 06_consultas_demostracion.sql.</w:t>
+        <w:t>Script SQL: script_completo.sql (un único archivo en seis partes: esquema, programabilidad, CRUD, vistas, datos, y consultas/pruebas).</w:t>
       </w:r>
     </w:p>
     <w:p>

</xml_diff>